<commit_message>
CRF, Ambiguity and text preprocessing in nlp
</commit_message>
<xml_diff>
--- a/NLp docss.docx
+++ b/NLp docss.docx
@@ -69,21 +69,12 @@
           <w:lang w:val="en-US"/>
         </w:rPr>
       </w:pPr>
-      <w:proofErr w:type="spellStart"/>
-      <w:r>
-        <w:rPr>
-          <w:b/>
-          <w:lang w:val="en-US"/>
-        </w:rPr>
-        <w:t>Github</w:t>
-      </w:r>
-      <w:proofErr w:type="spellEnd"/>
-      <w:r>
-        <w:rPr>
-          <w:b/>
-          <w:lang w:val="en-US"/>
-        </w:rPr>
-        <w:t xml:space="preserve"> URL:</w:t>
+      <w:r>
+        <w:rPr>
+          <w:b/>
+          <w:lang w:val="en-US"/>
+        </w:rPr>
+        <w:t>Github URL:</w:t>
       </w:r>
       <w:r>
         <w:rPr>
@@ -92,28 +83,12 @@
         </w:rPr>
         <w:t xml:space="preserve"> </w:t>
       </w:r>
-      <w:proofErr w:type="spellStart"/>
-      <w:r>
-        <w:rPr>
-          <w:lang w:val="en-US"/>
-        </w:rPr>
-        <w:t>github</w:t>
-      </w:r>
-      <w:proofErr w:type="spellEnd"/>
-      <w:r>
-        <w:rPr>
-          <w:lang w:val="en-US"/>
-        </w:rPr>
-        <w:t>/</w:t>
-      </w:r>
-      <w:proofErr w:type="spellStart"/>
-      <w:r>
-        <w:rPr>
-          <w:lang w:val="en-US"/>
-        </w:rPr>
-        <w:t>Phyboc</w:t>
-      </w:r>
-      <w:proofErr w:type="spellEnd"/>
+      <w:r>
+        <w:rPr>
+          <w:lang w:val="en-US"/>
+        </w:rPr>
+        <w:t>github/Phyboc</w:t>
+      </w:r>
     </w:p>
     <w:p>
       <w:pPr>
@@ -403,23 +378,7 @@
           <w:b/>
           <w:lang w:val="en-US"/>
         </w:rPr>
-        <w:t xml:space="preserve">Data Engineering and </w:t>
-      </w:r>
-      <w:proofErr w:type="spellStart"/>
-      <w:r>
-        <w:rPr>
-          <w:b/>
-          <w:lang w:val="en-US"/>
-        </w:rPr>
-        <w:t>MLOps</w:t>
-      </w:r>
-      <w:proofErr w:type="spellEnd"/>
-      <w:r>
-        <w:rPr>
-          <w:b/>
-          <w:lang w:val="en-US"/>
-        </w:rPr>
-        <w:t xml:space="preserve"> Skills</w:t>
+        <w:t>Data Engineering and MLOps Skills</w:t>
       </w:r>
     </w:p>
     <w:p>
@@ -448,19 +407,11 @@
           <w:lang w:val="en-US"/>
         </w:rPr>
       </w:pPr>
-      <w:proofErr w:type="spellStart"/>
-      <w:r>
-        <w:rPr>
-          <w:lang w:val="en-US"/>
-        </w:rPr>
-        <w:t>Groundedness</w:t>
-      </w:r>
-      <w:proofErr w:type="spellEnd"/>
-      <w:r>
-        <w:rPr>
-          <w:lang w:val="en-US"/>
-        </w:rPr>
-        <w:t xml:space="preserve"> Evaluation</w:t>
+      <w:r>
+        <w:rPr>
+          <w:lang w:val="en-US"/>
+        </w:rPr>
+        <w:t>Groundedness Evaluation</w:t>
       </w:r>
       <w:r>
         <w:rPr>
@@ -576,21 +527,7 @@
         <w:rPr>
           <w:lang w:val="en-US"/>
         </w:rPr>
-        <w:t xml:space="preserve">Code reference for </w:t>
-      </w:r>
-      <w:proofErr w:type="spellStart"/>
-      <w:r>
-        <w:rPr>
-          <w:lang w:val="en-US"/>
-        </w:rPr>
-        <w:t>nlp</w:t>
-      </w:r>
-      <w:proofErr w:type="spellEnd"/>
-      <w:r>
-        <w:rPr>
-          <w:lang w:val="en-US"/>
-        </w:rPr>
-        <w:t>:</w:t>
+        <w:t>Code reference for nlp:</w:t>
       </w:r>
     </w:p>
     <w:p>
@@ -631,11 +568,1171 @@
           <w:lang w:val="en-US"/>
         </w:rPr>
       </w:pPr>
-      <w:r>
-        <w:rPr>
-          <w:lang w:val="en-US"/>
-        </w:rPr>
-        <w:t>https://www.kaggle.com/code/uthamkanth/beginner-tf-idf-and-cosine-similarity-from-scratch</w:t>
+      <w:hyperlink r:id="rId8" w:history="1">
+        <w:r>
+          <w:rPr>
+            <w:rStyle w:val="Hyperlink"/>
+            <w:lang w:val="en-US"/>
+          </w:rPr>
+          <w:t>https://www.kaggle.com/code/uthamkanth/beginner-tf-idf-and-cosine-similarity-from-scratch</w:t>
+        </w:r>
+      </w:hyperlink>
+    </w:p>
+    <w:p>
+      <w:pPr>
+        <w:rPr>
+          <w:b/>
+          <w:bCs/>
+          <w:u w:val="single"/>
+          <w:lang w:val="en-US"/>
+        </w:rPr>
+      </w:pPr>
+      <w:r>
+        <w:rPr>
+          <w:b/>
+          <w:bCs/>
+          <w:u w:val="single"/>
+          <w:lang w:val="en-US"/>
+        </w:rPr>
+        <w:lastRenderedPageBreak/>
+        <w:t>Corpus</w:t>
+      </w:r>
+      <w:r>
+        <w:rPr>
+          <w:b/>
+          <w:bCs/>
+          <w:u w:val="single"/>
+          <w:lang w:val="en-US"/>
+        </w:rPr>
+        <w:t>:</w:t>
+      </w:r>
+    </w:p>
+    <w:p>
+      <w:pPr>
+        <w:rPr>
+          <w:lang w:val="en-US"/>
+        </w:rPr>
+      </w:pPr>
+      <w:r>
+        <w:rPr>
+          <w:lang w:val="en-US"/>
+        </w:rPr>
+        <w:t>TreeBank:</w:t>
+      </w:r>
+    </w:p>
+    <w:p>
+      <w:pPr>
+        <w:rPr>
+          <w:lang w:val="en-US"/>
+        </w:rPr>
+      </w:pPr>
+      <w:r>
+        <w:rPr>
+          <w:lang w:val="en-US"/>
+        </w:rPr>
+        <w:t>Motivation:</w:t>
+      </w:r>
+    </w:p>
+    <w:p>
+      <w:pPr>
+        <w:rPr>
+          <w:lang w:val="en-US"/>
+        </w:rPr>
+      </w:pPr>
+      <w:r>
+        <w:rPr>
+          <w:lang w:val="en-US"/>
+        </w:rPr>
+        <w:t>Before treebanks, rule-based NLP systems were heavily bottlenecked by linguistic ambiguity and lacked a way to calculate probabilistic language patterns at scale. Treebanks provided the large-scale, empirical, human-annotated data required to transition NLP from rigid, manual rule-writing into statistical, machine-learning-based parsing. Treebanks established modern empirical norms like standardized train/test splits and evaluation metrics (e.g., Parseval) so models could be universally compared.</w:t>
+      </w:r>
+    </w:p>
+    <w:p>
+      <w:pPr>
+        <w:rPr>
+          <w:lang w:val="en-US"/>
+        </w:rPr>
+      </w:pPr>
+    </w:p>
+    <w:p>
+      <w:pPr>
+        <w:rPr>
+          <w:lang w:val="en-US"/>
+        </w:rPr>
+      </w:pPr>
+      <w:r>
+        <w:rPr>
+          <w:lang w:val="en-US"/>
+        </w:rPr>
+        <w:t>Working Principle Behind it:</w:t>
+      </w:r>
+    </w:p>
+    <w:p>
+      <w:pPr>
+        <w:rPr>
+          <w:lang w:val="en-US"/>
+        </w:rPr>
+      </w:pPr>
+      <w:r>
+        <w:rPr>
+          <w:lang w:val="en-US"/>
+        </w:rPr>
+        <w:t>Treebank construction relies on a structured, multi-stage linguistic pipeline:Tokenization and Lemmatization: Text is separated into discrete tokens (words, punctuation) and assigned base forms.Part-of-Speech (POS) Tagging: Each token is tagged with its grammatical class (e.g., Noun, Verb, Adjective).Syntactic Annotation (The Tree Structure): Human annotators map the grammatical relationships of the sentence using tree structures, primarily divided into:Phrase Structure: Groups words into nested constituents like Noun Phrases (NP) and Verb Phrases (VP).Dependency Structure: Captures direct word-to-word relationships, linking modifiers directly to their head words.</w:t>
+      </w:r>
+    </w:p>
+    <w:p>
+      <w:pPr>
+        <w:rPr>
+          <w:lang w:val="en-US"/>
+        </w:rPr>
+      </w:pPr>
+    </w:p>
+    <w:p>
+      <w:pPr>
+        <w:rPr>
+          <w:lang w:val="en-US"/>
+        </w:rPr>
+      </w:pPr>
+      <w:r>
+        <w:rPr>
+          <w:lang w:val="en-US"/>
+        </w:rPr>
+        <w:t>Relevance for NLP:</w:t>
+      </w:r>
+    </w:p>
+    <w:p>
+      <w:pPr>
+        <w:rPr>
+          <w:lang w:val="en-US"/>
+        </w:rPr>
+      </w:pPr>
+      <w:r>
+        <w:rPr>
+          <w:lang w:val="en-US"/>
+        </w:rPr>
+        <w:t>Treebanks act as the "ground truth" that powers foundational NLP components and downstream applications:Syntactic Parsing: Treebanks allow algorithms to deduce grammatical rules and syntax trees from data, which helps resolve sentence-level ambiguities.Machine Translation: By understanding the structural transfer from one language's treebank to another, models can produce much more accurate translations.Semantic Role Labeling: Treebanks train models to recognize "who did what to whom," establishing context and underlying meaning.</w:t>
+      </w:r>
+    </w:p>
+    <w:p>
+      <w:pPr>
+        <w:rPr>
+          <w:lang w:val="en-US"/>
+        </w:rPr>
+      </w:pPr>
+    </w:p>
+    <w:p>
+      <w:pPr>
+        <w:rPr>
+          <w:lang w:val="en-US"/>
+        </w:rPr>
+      </w:pPr>
+      <w:r>
+        <w:rPr>
+          <w:lang w:val="en-US"/>
+        </w:rPr>
+        <w:t>URL:</w:t>
+      </w:r>
+    </w:p>
+    <w:p>
+      <w:pPr>
+        <w:rPr>
+          <w:lang w:val="en-US"/>
+        </w:rPr>
+      </w:pPr>
+      <w:r>
+        <w:rPr>
+          <w:lang w:val="en-US"/>
+        </w:rPr>
+        <w:t>https://catalog.ldc.upenn.edu/LDC99T42</w:t>
+      </w:r>
+    </w:p>
+    <w:p>
+      <w:pPr>
+        <w:rPr>
+          <w:lang w:val="en-US"/>
+        </w:rPr>
+      </w:pPr>
+    </w:p>
+    <w:p>
+      <w:pPr>
+        <w:rPr>
+          <w:lang w:val="en-US"/>
+        </w:rPr>
+      </w:pPr>
+      <w:r>
+        <w:rPr>
+          <w:lang w:val="en-US"/>
+        </w:rPr>
+        <w:t>PropBank:</w:t>
+      </w:r>
+    </w:p>
+    <w:p>
+      <w:pPr>
+        <w:rPr>
+          <w:lang w:val="en-US"/>
+        </w:rPr>
+      </w:pPr>
+      <w:r>
+        <w:rPr>
+          <w:lang w:val="en-US"/>
+        </w:rPr>
+        <w:t>Motivation:</w:t>
+      </w:r>
+    </w:p>
+    <w:p>
+      <w:pPr>
+        <w:rPr>
+          <w:lang w:val="en-US"/>
+        </w:rPr>
+      </w:pPr>
+      <w:r>
+        <w:rPr>
+          <w:lang w:val="en-US"/>
+        </w:rPr>
+        <w:t>Before PropBank, syntactic treebanks (like mapping parts of speech and phrases) were limited because they couldn't capture the underlying meaning of an action. The motivation was to create a large-scale, consistent training dataset that links surface-level syntax (e.g., subject, object) to deeper semantic roles (e.g., agent, patient) across different ways of phrasing the same event.</w:t>
+      </w:r>
+    </w:p>
+    <w:p>
+      <w:pPr>
+        <w:rPr>
+          <w:lang w:val="en-US"/>
+        </w:rPr>
+      </w:pPr>
+    </w:p>
+    <w:p>
+      <w:pPr>
+        <w:rPr>
+          <w:lang w:val="en-US"/>
+        </w:rPr>
+      </w:pPr>
+      <w:r>
+        <w:rPr>
+          <w:lang w:val="en-US"/>
+        </w:rPr>
+        <w:t>Working Principle behind it:</w:t>
+      </w:r>
+    </w:p>
+    <w:p>
+      <w:pPr>
+        <w:rPr>
+          <w:lang w:val="en-US"/>
+        </w:rPr>
+      </w:pPr>
+      <w:r>
+        <w:rPr>
+          <w:lang w:val="en-US"/>
+        </w:rPr>
+        <w:lastRenderedPageBreak/>
+        <w:t xml:space="preserve">PropBank annotates texts based on the predicate (the verb) and its associated arguments. </w:t>
+      </w:r>
+    </w:p>
+    <w:p>
+      <w:pPr>
+        <w:rPr>
+          <w:lang w:val="en-US"/>
+        </w:rPr>
+      </w:pPr>
+    </w:p>
+    <w:p>
+      <w:pPr>
+        <w:rPr>
+          <w:lang w:val="en-US"/>
+        </w:rPr>
+      </w:pPr>
+      <w:r>
+        <w:rPr>
+          <w:lang w:val="en-US"/>
+        </w:rPr>
+        <w:t xml:space="preserve">Predicates &amp; Framesets: Each verb in the corpus has an associated "frameset" in an XML frame file. This file defines the different senses of the verb. </w:t>
+      </w:r>
+    </w:p>
+    <w:p>
+      <w:pPr>
+        <w:rPr>
+          <w:lang w:val="en-US"/>
+        </w:rPr>
+      </w:pPr>
+    </w:p>
+    <w:p>
+      <w:pPr>
+        <w:rPr>
+          <w:lang w:val="en-US"/>
+        </w:rPr>
+      </w:pPr>
+      <w:r>
+        <w:rPr>
+          <w:lang w:val="en-US"/>
+        </w:rPr>
+        <w:t xml:space="preserve">Core Arguments: Numbered tags—from ARG0 to ARG5—represent core participants in the action. For example, ARG0 usually represents the agent (doer) and ARG1 the patient (undergoer). </w:t>
+      </w:r>
+    </w:p>
+    <w:p>
+      <w:pPr>
+        <w:rPr>
+          <w:lang w:val="en-US"/>
+        </w:rPr>
+      </w:pPr>
+    </w:p>
+    <w:p>
+      <w:pPr>
+        <w:rPr>
+          <w:lang w:val="en-US"/>
+        </w:rPr>
+      </w:pPr>
+      <w:r>
+        <w:rPr>
+          <w:lang w:val="en-US"/>
+        </w:rPr>
+        <w:t xml:space="preserve">Adjunctive Arguments: Modifier tags—such as ARGM-TMP (Time), ARGM-LOC (Location), and ARGM-MNR (Manner)—are used consistently across all verbs to provide additional context. </w:t>
+      </w:r>
+    </w:p>
+    <w:p>
+      <w:pPr>
+        <w:rPr>
+          <w:lang w:val="en-US"/>
+        </w:rPr>
+      </w:pPr>
+    </w:p>
+    <w:p>
+      <w:pPr>
+        <w:rPr>
+          <w:lang w:val="en-US"/>
+        </w:rPr>
+      </w:pPr>
+      <w:r>
+        <w:rPr>
+          <w:lang w:val="en-US"/>
+        </w:rPr>
+        <w:t>Relevance to NLP:</w:t>
+      </w:r>
+    </w:p>
+    <w:p>
+      <w:pPr>
+        <w:rPr>
+          <w:lang w:val="en-US"/>
+        </w:rPr>
+      </w:pPr>
+      <w:r>
+        <w:rPr>
+          <w:lang w:val="en-US"/>
+        </w:rPr>
+        <w:t xml:space="preserve">PropBank is considered a cornerstone resource for Natural Language Processing for several reasons: </w:t>
+      </w:r>
+    </w:p>
+    <w:p>
+      <w:pPr>
+        <w:rPr>
+          <w:lang w:val="en-US"/>
+        </w:rPr>
+      </w:pPr>
+      <w:r>
+        <w:rPr>
+          <w:lang w:val="en-US"/>
+        </w:rPr>
+        <w:t xml:space="preserve">Semantic Role Labeling (SRL): PropBank served as the primary training and testing data for developing statistical and machine learning models for SRL—a core NLP task essential for machine translation, question answering, and information extraction. </w:t>
+      </w:r>
+    </w:p>
+    <w:p>
+      <w:pPr>
+        <w:rPr>
+          <w:lang w:val="en-US"/>
+        </w:rPr>
+      </w:pPr>
+    </w:p>
+    <w:p>
+      <w:pPr>
+        <w:rPr>
+          <w:lang w:val="en-US"/>
+        </w:rPr>
+      </w:pPr>
+      <w:r>
+        <w:rPr>
+          <w:lang w:val="en-US"/>
+        </w:rPr>
+        <w:t xml:space="preserve">Generalization: By distinguishing between different senses of a word and standardizing roles, NLP systems can better understand the core meaning of a sentence regardless of how it is syntactically structured. </w:t>
+      </w:r>
+    </w:p>
+    <w:p>
+      <w:pPr>
+        <w:rPr>
+          <w:lang w:val="en-US"/>
+        </w:rPr>
+      </w:pPr>
+    </w:p>
+    <w:p>
+      <w:pPr>
+        <w:rPr>
+          <w:lang w:val="en-US"/>
+        </w:rPr>
+      </w:pPr>
+      <w:r>
+        <w:rPr>
+          <w:lang w:val="en-US"/>
+        </w:rPr>
+        <w:t xml:space="preserve">Cross-lingual NLP: PropBank principles have been extended into multilingual projects, facilitating cross-lingual semantic parsing and unified multilingual NLP tasks. </w:t>
+      </w:r>
+    </w:p>
+    <w:p>
+      <w:pPr>
+        <w:rPr>
+          <w:lang w:val="en-US"/>
+        </w:rPr>
+      </w:pPr>
+    </w:p>
+    <w:p>
+      <w:pPr>
+        <w:rPr>
+          <w:lang w:val="en-US"/>
+        </w:rPr>
+      </w:pPr>
+      <w:r>
+        <w:rPr>
+          <w:lang w:val="en-US"/>
+        </w:rPr>
+        <w:t>URL:</w:t>
+      </w:r>
+    </w:p>
+    <w:p>
+      <w:pPr>
+        <w:rPr>
+          <w:lang w:val="en-US"/>
+        </w:rPr>
+      </w:pPr>
+      <w:r>
+        <w:rPr>
+          <w:lang w:val="en-US"/>
+        </w:rPr>
+        <w:t>https://propbank.github.io/</w:t>
+      </w:r>
+    </w:p>
+    <w:p>
+      <w:pPr>
+        <w:rPr>
+          <w:lang w:val="en-US"/>
+        </w:rPr>
+      </w:pPr>
+    </w:p>
+    <w:p>
+      <w:pPr>
+        <w:rPr>
+          <w:lang w:val="en-US"/>
+        </w:rPr>
+      </w:pPr>
+      <w:r>
+        <w:rPr>
+          <w:lang w:val="en-US"/>
+        </w:rPr>
+        <w:t>WordNet:</w:t>
+      </w:r>
+    </w:p>
+    <w:p>
+      <w:pPr>
+        <w:rPr>
+          <w:lang w:val="en-US"/>
+        </w:rPr>
+      </w:pPr>
+      <w:r>
+        <w:rPr>
+          <w:lang w:val="en-US"/>
+        </w:rPr>
+        <w:t>Motivation:</w:t>
+      </w:r>
+    </w:p>
+    <w:p>
+      <w:pPr>
+        <w:rPr>
+          <w:lang w:val="en-US"/>
+        </w:rPr>
+      </w:pPr>
+      <w:r>
+        <w:rPr>
+          <w:lang w:val="en-US"/>
+        </w:rPr>
+        <w:t>Standard dictionaries organize words alphabetically, ignoring semantic relationships. The creators of WordNet wanted to build a database consistent with human psychological models of conceptual knowledge, allowing systems to understand meanings rather than just literal character strings.</w:t>
+      </w:r>
+    </w:p>
+    <w:p>
+      <w:pPr>
+        <w:rPr>
+          <w:lang w:val="en-US"/>
+        </w:rPr>
+      </w:pPr>
+      <w:r>
+        <w:rPr>
+          <w:lang w:val="en-US"/>
+        </w:rPr>
+        <w:t>Working Principle:</w:t>
+      </w:r>
+    </w:p>
+    <w:p>
+      <w:pPr>
+        <w:rPr>
+          <w:lang w:val="en-US"/>
+        </w:rPr>
+      </w:pPr>
+      <w:r>
+        <w:rPr>
+          <w:lang w:val="en-US"/>
+        </w:rPr>
+        <w:t xml:space="preserve">WordNet operates as a directed graph where nodes are concepts and edges are relations:Synsets: Words are grouped into sets of synonyms that represent a single conceptual idea (e.g., {car, </w:t>
+      </w:r>
+      <w:r>
+        <w:rPr>
+          <w:lang w:val="en-US"/>
+        </w:rPr>
+        <w:lastRenderedPageBreak/>
+        <w:t>automobile, motorcar}).Gloss &amp; Examples: Each synset includes a brief definition and example sentences.Semantic Relations: Synsets are connected through relationships like:Hypernymy / Hyponymy: Is-a / subclass hierarchies (e.g., dog is a hyponym of animal).Meronymy: Part-whole relationships (e.g., wheel is a part of a car).Antonymy: Opposites.</w:t>
+      </w:r>
+    </w:p>
+    <w:p>
+      <w:pPr>
+        <w:rPr>
+          <w:lang w:val="en-US"/>
+        </w:rPr>
+      </w:pPr>
+      <w:r>
+        <w:rPr>
+          <w:lang w:val="en-US"/>
+        </w:rPr>
+        <w:t>Relevance for NLP:</w:t>
+      </w:r>
+    </w:p>
+    <w:p>
+      <w:pPr>
+        <w:rPr>
+          <w:lang w:val="en-US"/>
+        </w:rPr>
+      </w:pPr>
+      <w:r>
+        <w:rPr>
+          <w:lang w:val="en-US"/>
+        </w:rPr>
+        <w:t>WordNet is a fundamental resource in natural language processing (NLP) for several reasons:Word Sense Disambiguation (WSD): It helps algorithms determine the exact meaning of an ambiguous word in context (e.g., identifying whether "bank" refers to a financial institution or a riverbed).Semantic Similarity: NLP models use WordNet to calculate how closely related two concepts are by measuring the distance between them in the graph.Query Expansion &amp; Information Retrieval: Search engines utilize WordNet synonyms to broaden searches and retrieve relevant results based on user intent rather than just exact keyword matches.</w:t>
+      </w:r>
+    </w:p>
+    <w:p>
+      <w:pPr>
+        <w:rPr>
+          <w:lang w:val="en-US"/>
+        </w:rPr>
+      </w:pPr>
+      <w:r>
+        <w:rPr>
+          <w:lang w:val="en-US"/>
+        </w:rPr>
+        <w:t>URL:</w:t>
+      </w:r>
+    </w:p>
+    <w:p>
+      <w:pPr>
+        <w:rPr>
+          <w:lang w:val="en-US"/>
+        </w:rPr>
+      </w:pPr>
+      <w:hyperlink r:id="rId9" w:history="1">
+        <w:r>
+          <w:rPr>
+            <w:rStyle w:val="Hyperlink"/>
+            <w:lang w:val="en-US"/>
+          </w:rPr>
+          <w:t>https://wordnet.princeton.edu/</w:t>
+        </w:r>
+      </w:hyperlink>
+    </w:p>
+    <w:p>
+      <w:pPr>
+        <w:rPr>
+          <w:lang w:val="en-US"/>
+        </w:rPr>
+      </w:pPr>
+    </w:p>
+    <w:p>
+      <w:pPr>
+        <w:rPr>
+          <w:lang w:val="en-US"/>
+        </w:rPr>
+      </w:pPr>
+      <w:r>
+        <w:rPr>
+          <w:lang w:val="en-US"/>
+        </w:rPr>
+        <w:t>VerbNet:</w:t>
+      </w:r>
+    </w:p>
+    <w:p>
+      <w:pPr>
+        <w:rPr>
+          <w:b/>
+          <w:bCs/>
+        </w:rPr>
+      </w:pPr>
+      <w:r>
+        <w:rPr>
+          <w:b/>
+          <w:bCs/>
+        </w:rPr>
+        <w:t>Motivation</w:t>
+      </w:r>
+    </w:p>
+    <w:p>
+      <w:r>
+        <w:t xml:space="preserve">Before VerbNet, linguistic resources were either too broad (like WordNet's simple synonyms) or lacked deep semantic generalizations (like early machine translations). The primary motivation was to computationally realize </w:t>
+      </w:r>
+      <w:r>
+        <w:rPr>
+          <w:b/>
+          <w:bCs/>
+        </w:rPr>
+        <w:t>Beth Levin's 1993 verb classification</w:t>
+      </w:r>
+      <w:r>
+        <w:t>. By hypothesizing that a verb's syntactic behavior is heavily dictated by its meaning, VerbNet was designed to uncover generalized patterns in human language. [</w:t>
+      </w:r>
+      <w:hyperlink r:id="rId10" w:history="1">
+        <w:r>
+          <w:rPr>
+            <w:rStyle w:val="Hyperlink"/>
+          </w:rPr>
+          <w:t>1</w:t>
+        </w:r>
+      </w:hyperlink>
+      <w:r>
+        <w:t xml:space="preserve">, </w:t>
+      </w:r>
+      <w:hyperlink r:id="rId11" w:history="1">
+        <w:r>
+          <w:rPr>
+            <w:rStyle w:val="Hyperlink"/>
+          </w:rPr>
+          <w:t>2</w:t>
+        </w:r>
+      </w:hyperlink>
+      <w:r>
+        <w:t xml:space="preserve">, </w:t>
+      </w:r>
+      <w:hyperlink r:id="rId12" w:history="1">
+        <w:r>
+          <w:rPr>
+            <w:rStyle w:val="Hyperlink"/>
+          </w:rPr>
+          <w:t>3</w:t>
+        </w:r>
+      </w:hyperlink>
+      <w:r>
+        <w:t xml:space="preserve">, </w:t>
+      </w:r>
+      <w:hyperlink r:id="rId13" w:history="1">
+        <w:r>
+          <w:rPr>
+            <w:rStyle w:val="Hyperlink"/>
+          </w:rPr>
+          <w:t>4</w:t>
+        </w:r>
+      </w:hyperlink>
+      <w:r>
+        <w:t>]</w:t>
+      </w:r>
+    </w:p>
+    <w:p>
+      <w:pPr>
+        <w:rPr>
+          <w:b/>
+          <w:bCs/>
+        </w:rPr>
+      </w:pPr>
+      <w:r>
+        <w:rPr>
+          <w:b/>
+          <w:bCs/>
+        </w:rPr>
+        <w:t>Working Principle</w:t>
+      </w:r>
+    </w:p>
+    <w:p>
+      <w:r>
+        <w:t>VerbNet organizes verbs into a hierarchical structure where each class contains highly specific linguistic properties: [</w:t>
+      </w:r>
+      <w:hyperlink r:id="rId14" w:history="1">
+        <w:r>
+          <w:rPr>
+            <w:rStyle w:val="Hyperlink"/>
+          </w:rPr>
+          <w:t>1</w:t>
+        </w:r>
+      </w:hyperlink>
+      <w:r>
+        <w:t xml:space="preserve">, </w:t>
+      </w:r>
+      <w:hyperlink r:id="rId15" w:history="1">
+        <w:r>
+          <w:rPr>
+            <w:rStyle w:val="Hyperlink"/>
+          </w:rPr>
+          <w:t>2</w:t>
+        </w:r>
+      </w:hyperlink>
+      <w:r>
+        <w:t xml:space="preserve">, </w:t>
+      </w:r>
+      <w:hyperlink r:id="rId16" w:history="1">
+        <w:r>
+          <w:rPr>
+            <w:rStyle w:val="Hyperlink"/>
+          </w:rPr>
+          <w:t>3</w:t>
+        </w:r>
+      </w:hyperlink>
+      <w:r>
+        <w:t xml:space="preserve">, </w:t>
+      </w:r>
+      <w:hyperlink r:id="rId17" w:history="1">
+        <w:r>
+          <w:rPr>
+            <w:rStyle w:val="Hyperlink"/>
+          </w:rPr>
+          <w:t>4</w:t>
+        </w:r>
+      </w:hyperlink>
+      <w:r>
+        <w:t>]</w:t>
+      </w:r>
+    </w:p>
+    <w:p>
+      <w:pPr>
+        <w:numPr>
+          <w:ilvl w:val="0"/>
+          <w:numId w:val="4"/>
+        </w:numPr>
+      </w:pPr>
+      <w:r>
+        <w:rPr>
+          <w:b/>
+          <w:bCs/>
+        </w:rPr>
+        <w:t>Diathesis Alternations:</w:t>
+      </w:r>
+      <w:r>
+        <w:t xml:space="preserve"> Verbs in a class share syntactic frames and alternations (e.g., transitive vs. intransitive forms like </w:t>
+      </w:r>
+      <w:r>
+        <w:rPr>
+          <w:i/>
+          <w:iCs/>
+        </w:rPr>
+        <w:t>"John broke the window"</w:t>
+      </w:r>
+      <w:r>
+        <w:t xml:space="preserve"> vs. </w:t>
+      </w:r>
+      <w:r>
+        <w:rPr>
+          <w:i/>
+          <w:iCs/>
+        </w:rPr>
+        <w:t>"The window broke"</w:t>
+      </w:r>
+      <w:r>
+        <w:t>). [</w:t>
+      </w:r>
+      <w:hyperlink r:id="rId18" w:history="1">
+        <w:r>
+          <w:rPr>
+            <w:rStyle w:val="Hyperlink"/>
+          </w:rPr>
+          <w:t>1</w:t>
+        </w:r>
+      </w:hyperlink>
+      <w:r>
+        <w:t xml:space="preserve">, </w:t>
+      </w:r>
+      <w:hyperlink r:id="rId19" w:history="1">
+        <w:r>
+          <w:rPr>
+            <w:rStyle w:val="Hyperlink"/>
+          </w:rPr>
+          <w:t>2</w:t>
+        </w:r>
+      </w:hyperlink>
+      <w:r>
+        <w:t>]</w:t>
+      </w:r>
+    </w:p>
+    <w:p>
+      <w:pPr>
+        <w:numPr>
+          <w:ilvl w:val="0"/>
+          <w:numId w:val="4"/>
+        </w:numPr>
+      </w:pPr>
+      <w:r>
+        <w:rPr>
+          <w:b/>
+          <w:bCs/>
+        </w:rPr>
+        <w:t>Thematic Roles:</w:t>
+      </w:r>
+      <w:r>
+        <w:t xml:space="preserve"> Arguments in a verb frame are assigned specific semantic roles (e.g., </w:t>
+      </w:r>
+      <w:r>
+        <w:rPr>
+          <w:i/>
+          <w:iCs/>
+        </w:rPr>
+        <w:t>Agent</w:t>
+      </w:r>
+      <w:r>
+        <w:t xml:space="preserve">, </w:t>
+      </w:r>
+      <w:r>
+        <w:rPr>
+          <w:i/>
+          <w:iCs/>
+        </w:rPr>
+        <w:t>Patient</w:t>
+      </w:r>
+      <w:r>
+        <w:t xml:space="preserve">, </w:t>
+      </w:r>
+      <w:r>
+        <w:rPr>
+          <w:i/>
+          <w:iCs/>
+        </w:rPr>
+        <w:t>Instrument</w:t>
+      </w:r>
+      <w:r>
+        <w:t>) restricted by certain selectional traits. [</w:t>
+      </w:r>
+      <w:hyperlink r:id="rId20" w:history="1">
+        <w:r>
+          <w:rPr>
+            <w:rStyle w:val="Hyperlink"/>
+          </w:rPr>
+          <w:t>1</w:t>
+        </w:r>
+      </w:hyperlink>
+      <w:r>
+        <w:t xml:space="preserve">, </w:t>
+      </w:r>
+      <w:hyperlink r:id="rId21" w:history="1">
+        <w:r>
+          <w:rPr>
+            <w:rStyle w:val="Hyperlink"/>
+          </w:rPr>
+          <w:t>2</w:t>
+        </w:r>
+      </w:hyperlink>
+      <w:r>
+        <w:t>]</w:t>
+      </w:r>
+    </w:p>
+    <w:p>
+      <w:pPr>
+        <w:numPr>
+          <w:ilvl w:val="0"/>
+          <w:numId w:val="4"/>
+        </w:numPr>
+      </w:pPr>
+      <w:r>
+        <w:rPr>
+          <w:b/>
+          <w:bCs/>
+        </w:rPr>
+        <w:t>Semantic Predicates:</w:t>
+      </w:r>
+      <w:r>
+        <w:t xml:space="preserve"> Each class provides first-order logic and temporal event structures (inspired by the Generative Lexicon), mapping participants from their initial states to their resulting states. [</w:t>
+      </w:r>
+      <w:hyperlink r:id="rId22" w:history="1">
+        <w:r>
+          <w:rPr>
+            <w:rStyle w:val="Hyperlink"/>
+          </w:rPr>
+          <w:t>1</w:t>
+        </w:r>
+      </w:hyperlink>
+      <w:r>
+        <w:t xml:space="preserve">, </w:t>
+      </w:r>
+      <w:hyperlink r:id="rId23" w:history="1">
+        <w:r>
+          <w:rPr>
+            <w:rStyle w:val="Hyperlink"/>
+          </w:rPr>
+          <w:t>2</w:t>
+        </w:r>
+      </w:hyperlink>
+      <w:r>
+        <w:t>]</w:t>
+      </w:r>
+    </w:p>
+    <w:p>
+      <w:pPr>
+        <w:rPr>
+          <w:b/>
+          <w:bCs/>
+        </w:rPr>
+      </w:pPr>
+      <w:r>
+        <w:rPr>
+          <w:b/>
+          <w:bCs/>
+        </w:rPr>
+        <w:t>Relevance for NLP</w:t>
+      </w:r>
+    </w:p>
+    <w:p>
+      <w:r>
+        <w:t xml:space="preserve">VerbNet is heavily utilized in </w:t>
+      </w:r>
+      <w:r>
+        <w:rPr>
+          <w:b/>
+          <w:bCs/>
+        </w:rPr>
+        <w:t>Natural Language Processing (NLP)</w:t>
+      </w:r>
+      <w:r>
+        <w:t xml:space="preserve"> for: [</w:t>
+      </w:r>
+      <w:hyperlink r:id="rId24" w:history="1">
+        <w:r>
+          <w:rPr>
+            <w:rStyle w:val="Hyperlink"/>
+          </w:rPr>
+          <w:t>1</w:t>
+        </w:r>
+      </w:hyperlink>
+      <w:r>
+        <w:t xml:space="preserve">, </w:t>
+      </w:r>
+      <w:hyperlink r:id="rId25" w:history="1">
+        <w:r>
+          <w:rPr>
+            <w:rStyle w:val="Hyperlink"/>
+          </w:rPr>
+          <w:t>2</w:t>
+        </w:r>
+      </w:hyperlink>
+      <w:r>
+        <w:t>]</w:t>
+      </w:r>
+    </w:p>
+    <w:p>
+      <w:pPr>
+        <w:numPr>
+          <w:ilvl w:val="0"/>
+          <w:numId w:val="5"/>
+        </w:numPr>
+      </w:pPr>
+      <w:r>
+        <w:rPr>
+          <w:b/>
+          <w:bCs/>
+        </w:rPr>
+        <w:t>Semantic Role Labeling (SRL):</w:t>
+      </w:r>
+      <w:r>
+        <w:t xml:space="preserve"> It helps algorithms accurately identify who did what to whom, regardless of sentence structure. [</w:t>
+      </w:r>
+      <w:hyperlink r:id="rId26" w:history="1">
+        <w:r>
+          <w:rPr>
+            <w:rStyle w:val="Hyperlink"/>
+          </w:rPr>
+          <w:t>1</w:t>
+        </w:r>
+      </w:hyperlink>
+      <w:r>
+        <w:t xml:space="preserve">, </w:t>
+      </w:r>
+      <w:hyperlink r:id="rId27" w:history="1">
+        <w:r>
+          <w:rPr>
+            <w:rStyle w:val="Hyperlink"/>
+          </w:rPr>
+          <w:t>2</w:t>
+        </w:r>
+      </w:hyperlink>
+      <w:r>
+        <w:t>]</w:t>
+      </w:r>
+    </w:p>
+    <w:p>
+      <w:pPr>
+        <w:numPr>
+          <w:ilvl w:val="0"/>
+          <w:numId w:val="5"/>
+        </w:numPr>
+      </w:pPr>
+      <w:r>
+        <w:rPr>
+          <w:b/>
+          <w:bCs/>
+        </w:rPr>
+        <w:t>Word Sense Disambiguation:</w:t>
+      </w:r>
+      <w:r>
+        <w:t xml:space="preserve"> It prevents misinterpretations of polysemous verbs (verbs with multiple meanings) by applying specific syntactic and semantic constraints. [</w:t>
+      </w:r>
+      <w:hyperlink r:id="rId28" w:history="1">
+        <w:r>
+          <w:rPr>
+            <w:rStyle w:val="Hyperlink"/>
+          </w:rPr>
+          <w:t>1</w:t>
+        </w:r>
+      </w:hyperlink>
+      <w:r>
+        <w:t xml:space="preserve">, </w:t>
+      </w:r>
+      <w:hyperlink r:id="rId29" w:history="1">
+        <w:r>
+          <w:rPr>
+            <w:rStyle w:val="Hyperlink"/>
+          </w:rPr>
+          <w:t>2</w:t>
+        </w:r>
+      </w:hyperlink>
+      <w:r>
+        <w:t xml:space="preserve">, </w:t>
+      </w:r>
+      <w:hyperlink r:id="rId30" w:history="1">
+        <w:r>
+          <w:rPr>
+            <w:rStyle w:val="Hyperlink"/>
+          </w:rPr>
+          <w:t>3</w:t>
+        </w:r>
+      </w:hyperlink>
+      <w:r>
+        <w:t>]</w:t>
+      </w:r>
+    </w:p>
+    <w:p>
+      <w:pPr>
+        <w:numPr>
+          <w:ilvl w:val="0"/>
+          <w:numId w:val="5"/>
+        </w:numPr>
+      </w:pPr>
+      <w:r>
+        <w:rPr>
+          <w:b/>
+          <w:bCs/>
+        </w:rPr>
+        <w:lastRenderedPageBreak/>
+        <w:t>Inference and Question Answering:</w:t>
+      </w:r>
+      <w:r>
+        <w:t xml:space="preserve"> The subevent sequences give machines the ability to map the preconditions and postconditions of events. [</w:t>
+      </w:r>
+      <w:hyperlink r:id="rId31" w:history="1">
+        <w:r>
+          <w:rPr>
+            <w:rStyle w:val="Hyperlink"/>
+          </w:rPr>
+          <w:t>1</w:t>
+        </w:r>
+      </w:hyperlink>
+      <w:r>
+        <w:t>]</w:t>
+      </w:r>
+    </w:p>
+    <w:p>
+      <w:pPr>
+        <w:numPr>
+          <w:ilvl w:val="0"/>
+          <w:numId w:val="5"/>
+        </w:numPr>
+      </w:pPr>
+      <w:r>
+        <w:rPr>
+          <w:b/>
+          <w:bCs/>
+        </w:rPr>
+        <w:t>Interoperability:</w:t>
+      </w:r>
+      <w:r>
+        <w:t xml:space="preserve"> Through the </w:t>
+      </w:r>
+      <w:hyperlink r:id="rId32" w:tgtFrame="_blank" w:history="1">
+        <w:r>
+          <w:rPr>
+            <w:rStyle w:val="Hyperlink"/>
+          </w:rPr>
+          <w:t>Unified Verb Index</w:t>
+        </w:r>
+      </w:hyperlink>
+      <w:r>
+        <w:t xml:space="preserve">, VerbNet links seamlessly with other core NLP lexical databases like </w:t>
+      </w:r>
+      <w:r>
+        <w:rPr>
+          <w:i/>
+          <w:iCs/>
+        </w:rPr>
+        <w:t>PropBank</w:t>
+      </w:r>
+      <w:r>
+        <w:t xml:space="preserve">, </w:t>
+      </w:r>
+      <w:r>
+        <w:rPr>
+          <w:i/>
+          <w:iCs/>
+        </w:rPr>
+        <w:t>FrameNet</w:t>
+      </w:r>
+      <w:r>
+        <w:t xml:space="preserve">, and </w:t>
+      </w:r>
+      <w:r>
+        <w:rPr>
+          <w:i/>
+          <w:iCs/>
+        </w:rPr>
+        <w:t>WordNet</w:t>
+      </w:r>
+      <w:r>
+        <w:t xml:space="preserve"> to enable robust semantic parsing. [</w:t>
+      </w:r>
+      <w:hyperlink r:id="rId33" w:history="1">
+        <w:r>
+          <w:rPr>
+            <w:rStyle w:val="Hyperlink"/>
+          </w:rPr>
+          <w:t>1</w:t>
+        </w:r>
+      </w:hyperlink>
+      <w:r>
+        <w:t>]</w:t>
+      </w:r>
+    </w:p>
+    <w:p>
+      <w:pPr>
+        <w:rPr>
+          <w:lang w:val="en-US"/>
+        </w:rPr>
+      </w:pPr>
+      <w:r>
+        <w:rPr>
+          <w:lang w:val="en-US"/>
+        </w:rPr>
+        <w:t>URL:</w:t>
+      </w:r>
+    </w:p>
+    <w:p>
+      <w:pPr>
+        <w:rPr>
+          <w:lang w:val="en-US"/>
+        </w:rPr>
+      </w:pPr>
+      <w:r>
+        <w:rPr>
+          <w:lang w:val="en-US"/>
+        </w:rPr>
+        <w:t>https://verbs.colorado.edu/verbnet/</w:t>
       </w:r>
     </w:p>
     <w:sectPr>
@@ -877,6 +1974,155 @@
     </w:lvl>
   </w:abstractNum>
   <w:abstractNum w:abstractNumId="2" w15:restartNumberingAfterBreak="0">
+    <w:nsid w:val="24632468"/>
+    <w:multiLevelType w:val="multilevel"/>
+    <w:tmpl w:val="B84E1214"/>
+    <w:lvl w:ilvl="0">
+      <w:start w:val="1"/>
+      <w:numFmt w:val="bullet"/>
+      <w:lvlText w:val=""/>
+      <w:lvlJc w:val="left"/>
+      <w:pPr>
+        <w:tabs>
+          <w:tab w:val="num" w:pos="720"/>
+        </w:tabs>
+        <w:ind w:left="720" w:hanging="360"/>
+      </w:pPr>
+      <w:rPr>
+        <w:rFonts w:ascii="Symbol" w:hAnsi="Symbol" w:hint="default"/>
+        <w:sz w:val="20"/>
+      </w:rPr>
+    </w:lvl>
+    <w:lvl w:ilvl="1" w:tentative="1">
+      <w:start w:val="1"/>
+      <w:numFmt w:val="bullet"/>
+      <w:lvlText w:val="o"/>
+      <w:lvlJc w:val="left"/>
+      <w:pPr>
+        <w:tabs>
+          <w:tab w:val="num" w:pos="1440"/>
+        </w:tabs>
+        <w:ind w:left="1440" w:hanging="360"/>
+      </w:pPr>
+      <w:rPr>
+        <w:rFonts w:ascii="Courier New" w:hAnsi="Courier New" w:hint="default"/>
+        <w:sz w:val="20"/>
+      </w:rPr>
+    </w:lvl>
+    <w:lvl w:ilvl="2" w:tentative="1">
+      <w:start w:val="1"/>
+      <w:numFmt w:val="bullet"/>
+      <w:lvlText w:val=""/>
+      <w:lvlJc w:val="left"/>
+      <w:pPr>
+        <w:tabs>
+          <w:tab w:val="num" w:pos="2160"/>
+        </w:tabs>
+        <w:ind w:left="2160" w:hanging="360"/>
+      </w:pPr>
+      <w:rPr>
+        <w:rFonts w:ascii="Wingdings" w:hAnsi="Wingdings" w:hint="default"/>
+        <w:sz w:val="20"/>
+      </w:rPr>
+    </w:lvl>
+    <w:lvl w:ilvl="3" w:tentative="1">
+      <w:start w:val="1"/>
+      <w:numFmt w:val="bullet"/>
+      <w:lvlText w:val=""/>
+      <w:lvlJc w:val="left"/>
+      <w:pPr>
+        <w:tabs>
+          <w:tab w:val="num" w:pos="2880"/>
+        </w:tabs>
+        <w:ind w:left="2880" w:hanging="360"/>
+      </w:pPr>
+      <w:rPr>
+        <w:rFonts w:ascii="Wingdings" w:hAnsi="Wingdings" w:hint="default"/>
+        <w:sz w:val="20"/>
+      </w:rPr>
+    </w:lvl>
+    <w:lvl w:ilvl="4" w:tentative="1">
+      <w:start w:val="1"/>
+      <w:numFmt w:val="bullet"/>
+      <w:lvlText w:val=""/>
+      <w:lvlJc w:val="left"/>
+      <w:pPr>
+        <w:tabs>
+          <w:tab w:val="num" w:pos="3600"/>
+        </w:tabs>
+        <w:ind w:left="3600" w:hanging="360"/>
+      </w:pPr>
+      <w:rPr>
+        <w:rFonts w:ascii="Wingdings" w:hAnsi="Wingdings" w:hint="default"/>
+        <w:sz w:val="20"/>
+      </w:rPr>
+    </w:lvl>
+    <w:lvl w:ilvl="5" w:tentative="1">
+      <w:start w:val="1"/>
+      <w:numFmt w:val="bullet"/>
+      <w:lvlText w:val=""/>
+      <w:lvlJc w:val="left"/>
+      <w:pPr>
+        <w:tabs>
+          <w:tab w:val="num" w:pos="4320"/>
+        </w:tabs>
+        <w:ind w:left="4320" w:hanging="360"/>
+      </w:pPr>
+      <w:rPr>
+        <w:rFonts w:ascii="Wingdings" w:hAnsi="Wingdings" w:hint="default"/>
+        <w:sz w:val="20"/>
+      </w:rPr>
+    </w:lvl>
+    <w:lvl w:ilvl="6" w:tentative="1">
+      <w:start w:val="1"/>
+      <w:numFmt w:val="bullet"/>
+      <w:lvlText w:val=""/>
+      <w:lvlJc w:val="left"/>
+      <w:pPr>
+        <w:tabs>
+          <w:tab w:val="num" w:pos="5040"/>
+        </w:tabs>
+        <w:ind w:left="5040" w:hanging="360"/>
+      </w:pPr>
+      <w:rPr>
+        <w:rFonts w:ascii="Wingdings" w:hAnsi="Wingdings" w:hint="default"/>
+        <w:sz w:val="20"/>
+      </w:rPr>
+    </w:lvl>
+    <w:lvl w:ilvl="7" w:tentative="1">
+      <w:start w:val="1"/>
+      <w:numFmt w:val="bullet"/>
+      <w:lvlText w:val=""/>
+      <w:lvlJc w:val="left"/>
+      <w:pPr>
+        <w:tabs>
+          <w:tab w:val="num" w:pos="5760"/>
+        </w:tabs>
+        <w:ind w:left="5760" w:hanging="360"/>
+      </w:pPr>
+      <w:rPr>
+        <w:rFonts w:ascii="Wingdings" w:hAnsi="Wingdings" w:hint="default"/>
+        <w:sz w:val="20"/>
+      </w:rPr>
+    </w:lvl>
+    <w:lvl w:ilvl="8" w:tentative="1">
+      <w:start w:val="1"/>
+      <w:numFmt w:val="bullet"/>
+      <w:lvlText w:val=""/>
+      <w:lvlJc w:val="left"/>
+      <w:pPr>
+        <w:tabs>
+          <w:tab w:val="num" w:pos="6480"/>
+        </w:tabs>
+        <w:ind w:left="6480" w:hanging="360"/>
+      </w:pPr>
+      <w:rPr>
+        <w:rFonts w:ascii="Wingdings" w:hAnsi="Wingdings" w:hint="default"/>
+        <w:sz w:val="20"/>
+      </w:rPr>
+    </w:lvl>
+  </w:abstractNum>
+  <w:abstractNum w:abstractNumId="3" w15:restartNumberingAfterBreak="0">
     <w:nsid w:val="52CA508A"/>
     <w:multiLevelType w:val="hybridMultilevel"/>
     <w:tmpl w:val="ED6A927C"/>
@@ -989,14 +2235,169 @@
       </w:rPr>
     </w:lvl>
   </w:abstractNum>
+  <w:abstractNum w:abstractNumId="4" w15:restartNumberingAfterBreak="0">
+    <w:nsid w:val="78AD4B9B"/>
+    <w:multiLevelType w:val="multilevel"/>
+    <w:tmpl w:val="7204A718"/>
+    <w:lvl w:ilvl="0">
+      <w:start w:val="1"/>
+      <w:numFmt w:val="bullet"/>
+      <w:lvlText w:val=""/>
+      <w:lvlJc w:val="left"/>
+      <w:pPr>
+        <w:tabs>
+          <w:tab w:val="num" w:pos="720"/>
+        </w:tabs>
+        <w:ind w:left="720" w:hanging="360"/>
+      </w:pPr>
+      <w:rPr>
+        <w:rFonts w:ascii="Symbol" w:hAnsi="Symbol" w:hint="default"/>
+        <w:sz w:val="20"/>
+      </w:rPr>
+    </w:lvl>
+    <w:lvl w:ilvl="1" w:tentative="1">
+      <w:start w:val="1"/>
+      <w:numFmt w:val="bullet"/>
+      <w:lvlText w:val="o"/>
+      <w:lvlJc w:val="left"/>
+      <w:pPr>
+        <w:tabs>
+          <w:tab w:val="num" w:pos="1440"/>
+        </w:tabs>
+        <w:ind w:left="1440" w:hanging="360"/>
+      </w:pPr>
+      <w:rPr>
+        <w:rFonts w:ascii="Courier New" w:hAnsi="Courier New" w:hint="default"/>
+        <w:sz w:val="20"/>
+      </w:rPr>
+    </w:lvl>
+    <w:lvl w:ilvl="2" w:tentative="1">
+      <w:start w:val="1"/>
+      <w:numFmt w:val="bullet"/>
+      <w:lvlText w:val=""/>
+      <w:lvlJc w:val="left"/>
+      <w:pPr>
+        <w:tabs>
+          <w:tab w:val="num" w:pos="2160"/>
+        </w:tabs>
+        <w:ind w:left="2160" w:hanging="360"/>
+      </w:pPr>
+      <w:rPr>
+        <w:rFonts w:ascii="Wingdings" w:hAnsi="Wingdings" w:hint="default"/>
+        <w:sz w:val="20"/>
+      </w:rPr>
+    </w:lvl>
+    <w:lvl w:ilvl="3" w:tentative="1">
+      <w:start w:val="1"/>
+      <w:numFmt w:val="bullet"/>
+      <w:lvlText w:val=""/>
+      <w:lvlJc w:val="left"/>
+      <w:pPr>
+        <w:tabs>
+          <w:tab w:val="num" w:pos="2880"/>
+        </w:tabs>
+        <w:ind w:left="2880" w:hanging="360"/>
+      </w:pPr>
+      <w:rPr>
+        <w:rFonts w:ascii="Wingdings" w:hAnsi="Wingdings" w:hint="default"/>
+        <w:sz w:val="20"/>
+      </w:rPr>
+    </w:lvl>
+    <w:lvl w:ilvl="4" w:tentative="1">
+      <w:start w:val="1"/>
+      <w:numFmt w:val="bullet"/>
+      <w:lvlText w:val=""/>
+      <w:lvlJc w:val="left"/>
+      <w:pPr>
+        <w:tabs>
+          <w:tab w:val="num" w:pos="3600"/>
+        </w:tabs>
+        <w:ind w:left="3600" w:hanging="360"/>
+      </w:pPr>
+      <w:rPr>
+        <w:rFonts w:ascii="Wingdings" w:hAnsi="Wingdings" w:hint="default"/>
+        <w:sz w:val="20"/>
+      </w:rPr>
+    </w:lvl>
+    <w:lvl w:ilvl="5" w:tentative="1">
+      <w:start w:val="1"/>
+      <w:numFmt w:val="bullet"/>
+      <w:lvlText w:val=""/>
+      <w:lvlJc w:val="left"/>
+      <w:pPr>
+        <w:tabs>
+          <w:tab w:val="num" w:pos="4320"/>
+        </w:tabs>
+        <w:ind w:left="4320" w:hanging="360"/>
+      </w:pPr>
+      <w:rPr>
+        <w:rFonts w:ascii="Wingdings" w:hAnsi="Wingdings" w:hint="default"/>
+        <w:sz w:val="20"/>
+      </w:rPr>
+    </w:lvl>
+    <w:lvl w:ilvl="6" w:tentative="1">
+      <w:start w:val="1"/>
+      <w:numFmt w:val="bullet"/>
+      <w:lvlText w:val=""/>
+      <w:lvlJc w:val="left"/>
+      <w:pPr>
+        <w:tabs>
+          <w:tab w:val="num" w:pos="5040"/>
+        </w:tabs>
+        <w:ind w:left="5040" w:hanging="360"/>
+      </w:pPr>
+      <w:rPr>
+        <w:rFonts w:ascii="Wingdings" w:hAnsi="Wingdings" w:hint="default"/>
+        <w:sz w:val="20"/>
+      </w:rPr>
+    </w:lvl>
+    <w:lvl w:ilvl="7" w:tentative="1">
+      <w:start w:val="1"/>
+      <w:numFmt w:val="bullet"/>
+      <w:lvlText w:val=""/>
+      <w:lvlJc w:val="left"/>
+      <w:pPr>
+        <w:tabs>
+          <w:tab w:val="num" w:pos="5760"/>
+        </w:tabs>
+        <w:ind w:left="5760" w:hanging="360"/>
+      </w:pPr>
+      <w:rPr>
+        <w:rFonts w:ascii="Wingdings" w:hAnsi="Wingdings" w:hint="default"/>
+        <w:sz w:val="20"/>
+      </w:rPr>
+    </w:lvl>
+    <w:lvl w:ilvl="8" w:tentative="1">
+      <w:start w:val="1"/>
+      <w:numFmt w:val="bullet"/>
+      <w:lvlText w:val=""/>
+      <w:lvlJc w:val="left"/>
+      <w:pPr>
+        <w:tabs>
+          <w:tab w:val="num" w:pos="6480"/>
+        </w:tabs>
+        <w:ind w:left="6480" w:hanging="360"/>
+      </w:pPr>
+      <w:rPr>
+        <w:rFonts w:ascii="Wingdings" w:hAnsi="Wingdings" w:hint="default"/>
+        <w:sz w:val="20"/>
+      </w:rPr>
+    </w:lvl>
+  </w:abstractNum>
   <w:num w:numId="1" w16cid:durableId="1424643953">
-    <w:abstractNumId w:val="2"/>
+    <w:abstractNumId w:val="3"/>
   </w:num>
   <w:num w:numId="2" w16cid:durableId="628167603">
     <w:abstractNumId w:val="1"/>
   </w:num>
   <w:num w:numId="3" w16cid:durableId="392583584">
     <w:abstractNumId w:val="0"/>
+  </w:num>
+  <w:num w:numId="4" w16cid:durableId="1791431947">
+    <w:abstractNumId w:val="2"/>
+  </w:num>
+  <w:num w:numId="5" w16cid:durableId="1897469319">
+    <w:abstractNumId w:val="4"/>
   </w:num>
 </w:numbering>
 </file>
@@ -1403,7 +2804,6 @@
   <w:style w:type="character" w:default="1" w:styleId="DefaultParagraphFont">
     <w:name w:val="Default Paragraph Font"/>
     <w:uiPriority w:val="1"/>
-    <w:semiHidden/>
     <w:unhideWhenUsed/>
   </w:style>
   <w:style w:type="table" w:default="1" w:styleId="TableNormal">

</xml_diff>